<commit_message>
Polish reviewer cockpit submission
</commit_message>
<xml_diff>
--- a/Cotiviti_Prompt2_Report_Mohammad_Saleh_Nikoopayan_Tak.docx
+++ b/Cotiviti_Prompt2_Report_Mohammad_Saleh_Nikoopayan_Tak.docx
@@ -26,7 +26,7 @@
           <w:color w:val="5A6069"/>
           <w:sz w:val="21"/>
         </w:rPr>
-        <w:t>Prompt 2 report | Author: Mohammad Saleh Nikoopayan Tak | June 28, 2026</w:t>
+        <w:t>Prompt 2 report | Author: Mohammad Saleh Nikoopayan Tak | June 2026</w:t>
       </w:r>
     </w:p>
     <w:p>
@@ -48,7 +48,7 @@
           <w:color w:val="141F2B"/>
           <w:sz w:val="21"/>
         </w:rPr>
-        <w:t>Cotiviti can use privacy-preserving claim graphs to detect suspicious payment patterns earlier, explain each lead to auditors, and share cross-payer signal without sharing raw claims.</w:t>
+        <w:t>Cotiviti can turn privacy-preserving claim graphs into a reviewer cockpit that detects suspicious payment patterns earlier, produces evidence cards for every lead, and broadens cross-payer learning without exposing raw claims.</w:t>
       </w:r>
     </w:p>
     <w:p>
@@ -64,7 +64,7 @@
         <w:jc w:val="both"/>
       </w:pPr>
       <w:r>
-        <w:t>Federated claim-graph intelligence is the use of privacy-preserving learning, heterogeneous graphs, anomaly detection, and explicit reason traces to support clinical and operational decisions in claims payment. Instead of treating a claim as a flat row, it models relationships among member, provider, procedure, diagnosis, place of service, modifier, history, peer group, and policy context. That view fits prompt 2 because it combines classification, inference, clustering, time-series anomaly detection, and chain reasoning for payment operations. It is also commercially relevant to Cotiviti because payment accuracy is a core solution area spanning claim accuracy, policy management, coding validation, clinical review, data mining, contract compliance, claim responsibility, coordination of benefits, and FWA pattern review (Cotiviti, 2026a).</w:t>
+        <w:t>Federated claim-graph intelligence is the use of privacy-preserving learning, heterogeneous graphs, anomaly detection, and explicit reason traces to support clinical and operational decisions in claims payment. Instead of treating a claim as a flat row, it models relationships among member, provider, procedure, diagnosis, place of service, modifier, history, peer group, and policy context. That view fits prompt 2 because it combines classification, inference, clustering, time-series anomaly detection, and chain reasoning for payment operations. The intended product posture is a reviewer cockpit, not autonomous denial: the system surfaces the right case, at the right time, with evidence a human reviewer can confirm, override, or return to monitoring.</w:t>
       </w:r>
     </w:p>
     <w:p>
@@ -72,7 +72,7 @@
         <w:jc w:val="both"/>
       </w:pPr>
       <w:r>
-        <w:t>The distinctive thesis is not to add another model. It is to make every high-risk lead explainable as an evidence chain: what changed, which peer baseline was violated, which code or diagnosis relationship matters, which policy or clinical rule is implicated, and what action should follow. Recent graph research supports this direction. Muhammad et al. (2025) transformed claims into heterogeneous graphs of patients, providers, diagnoses, and services, reported F-scores in the low-to-mid 80 percent range, and tested graph explainers. For Cotiviti, the practical lesson is that graph methods can surface patterns ordinary row-level rules miss, but they need investigator review, documentation, and quality controls.</w:t>
+        <w:t>The distinctive thesis is not to add another model. It is to make every high-risk lead explainable as an evidence card: what changed, which peer baseline was violated, which code or diagnosis relationship matters, which policy or clinical rule is implicated, what evidence is missing, what uncertainty remains, and what action should follow. This is commercially relevant to Cotiviti because payment accuracy is a core solution area spanning claim accuracy, policy management, coding validation, clinical review, data mining, contract compliance, claim responsibility, coordination of benefits, and FWA pattern review (Cotiviti, 2026a).</w:t>
       </w:r>
     </w:p>
     <w:p>
@@ -88,7 +88,7 @@
         <w:jc w:val="both"/>
       </w:pPr>
       <w:r>
-        <w:t>Three trends make the timing attractive. First, payment integrity pressure remains large and visible. CMS reported FY 2025 improper payment estimates of $28.83 billion for Medicare Fee-for-Service, $23.67 billion for Medicare Part C, $4.23 billion for Part D, and $37.39 billion for Medicaid (CMS, 2025). DOJ's June 23, 2026 National Health Care Fraud Takedown charged 455 defendants in schemes involving more than $6.5 billion in alleged false claims (U.S. Department of Justice, 2026). The issue is not that every improper payment is fraud. It is that payers need earlier review queues that distinguish documentation gaps, coding errors, medical necessity issues, and organized abuse.</w:t>
+        <w:t>Three trends make the timing attractive. First, payment integrity pressure remains large and visible. CMS reported FY 2025 improper payment estimates of $28.83 billion for Medicare Fee-for-Service, $23.67 billion for Medicare Part C, $4.23 billion for Part D, and $37.39 billion for Medicaid (CMS, 2025). DOJ's June 23, 2026 National Health Care Fraud Takedown charged 455 defendants in schemes involving more than $6.5 billion in alleged false claims (U.S. Department of Justice, 2026). The issue is not that every improper payment is fraud. It is that payers need earlier review queues that separate documentation gaps, coding errors, medical necessity concerns, policy disagreement, and organized abuse.</w:t>
       </w:r>
     </w:p>
     <w:p>
@@ -96,7 +96,7 @@
         <w:jc w:val="both"/>
       </w:pPr>
       <w:r>
-        <w:t>Second, payer data is becoming richer and more connected. Cotiviti's March 2025 acquisition of Edifecs added interoperability capabilities for data analytics, claims processing accuracy, value-based care, and streamlined payer-provider workflows (Cotiviti, 2025). Graph intelligence improves when claims, eligibility, encounters, contracts, medical records, and policy logic can be connected without forcing users to jump across systems.</w:t>
+        <w:t>Second, payer data is becoming richer and more connected. Cotiviti's March 2025 acquisition of Edifecs added interoperability capabilities for data analytics, claims processing accuracy, value-based care, and streamlined payer-provider workflows (Cotiviti, 2025). Graph intelligence improves when claims, eligibility, encounters, contracts, chart signals, and policy logic can be connected without forcing reviewers to jump across systems.</w:t>
       </w:r>
     </w:p>
     <w:p>
@@ -104,7 +104,7 @@
         <w:jc w:val="both"/>
       </w:pPr>
       <w:r>
-        <w:t>Third, privacy and trust are becoming product requirements. Raghi et al. (2025) presented a vertical federated learning approach for health insurance fraud detection that lets hospitals and insurers collaborate without pooling raw sensitive data. NIST's AI Risk Management Framework emphasizes governing, mapping, measuring, and managing AI risks across system lifecycles (NIST, 2023). A Cotiviti-grade solution should treat privacy, fairness, auditability, and human review as design features.</w:t>
+        <w:t>Third, governance is becoming a product feature. A 2025 systematic review found broad use of supervised, unsupervised, and semi-supervised machine learning in healthcare claims fraud detection, while noting persistent challenges around data quality, transparency, and deployment (du Preez et al., 2025). Recent insurance-anomaly work also shows the value of explainable unsupervised workflows that help expert investigators decide where to focus (De Meulemeester et al., 2025), and Raghi et al. (2025) show how vertical federated learning can support fraud detection without pooling sensitive raw data. A Cotiviti-grade solution should treat privacy, fairness, auditability, drift monitoring, and human review as design features.</w:t>
       </w:r>
     </w:p>
     <w:p>
@@ -120,7 +120,7 @@
         <w:jc w:val="both"/>
       </w:pPr>
       <w:r>
-        <w:t>The opportunity is to move payment integrity from siloed lead generation toward a shared intelligence layer. Cotiviti's FWA Pattern Review already combines provider scoring models, expert-driven rules, case tracking, and specialist review, and Cotiviti reports more than $21.2 billion in suspect FWA claims identified for clients in 2025 (Cotiviti, 2026b). A federated graph layer could strengthen that position by learning cross-client signal patterns while keeping raw client data separated. It could also reduce provider abrasion by giving auditors better reasons before outreach, triage, or record request.</w:t>
+        <w:t>The opportunity is to move payment integrity from siloed lead generation toward a shared intelligence layer. Cotiviti's FWA Pattern Review already combines provider scoring models, expert-driven rules, case tracking, and specialist review, and Cotiviti reports more than $21.2 billion in suspect FWA claims identified for clients in 2025 (Cotiviti, 2026b). A federated graph layer could strengthen that position by learning cross-client signal patterns while keeping raw client data separated. The highest-value target is the costly middle: cases where a human reviewer can act faster because peer context, policy cues, and missing evidence are already organized.</w:t>
       </w:r>
     </w:p>
     <w:p>
@@ -128,7 +128,7 @@
         <w:jc w:val="both"/>
       </w:pPr>
       <w:r>
-        <w:t>The threats are equally real. Graph models can reproduce payer mix and access patterns that reflect structural bias rather than misconduct. Poor calibration can create false positives, slow payment, or damage provider relationships. Privacy-preserving learning can still leak information through model updates if governance is weak. Sophisticated fraud also adapts. These risks argue for a guarded rollout: human-in-the-loop review, drift monitoring, appeal feedback, secure aggregation, model cards, and a clear distinction between fraud, waste, abuse, documentation error, and policy disagreement.</w:t>
+        <w:t>The threats are equally real. Graph models can reproduce payer mix and access patterns that reflect structural bias rather than misconduct. Poor calibration can create false positives, slow payment, or damage provider relationships. Privacy-preserving learning can still leak information through model updates if governance is weak. Sophisticated fraud also adapts. These risks argue for a guarded rollout aligned with NIST's AI risk functions: prepay shadow mode before production use, human-in-the-loop review, drift monitoring, appeal feedback, secure aggregation, model cards, evidence cards, and a clear distinction between fraud, waste, abuse, documentation error, and policy disagreement (NIST, 2023).</w:t>
       </w:r>
     </w:p>
     <w:p>
@@ -144,7 +144,7 @@
         <w:jc w:val="both"/>
       </w:pPr>
       <w:r>
-        <w:t>Option 1 is to build a Claim-Graph Utility Layer inside payment accuracy. The layer would standardize entities and edges, create explainable graph features, and support prepay and postpay products. Near-term value would be better lead prioritization; longer-term value would be a reusable pattern-recognition platform for payment, risk adjustment, quality, and operations.</w:t>
+        <w:t>Option 1 is to build a Claim-Graph Utility Layer inside payment accuracy. The layer would standardize entities and edges, create explainable graph features, and support prepay and postpay products. Near-term value would be better lead prioritization; longer-term value would be a reusable pattern-recognition platform for payment, risk adjustment, quality, provider education, and operations.</w:t>
       </w:r>
     </w:p>
     <w:p>
@@ -152,7 +152,7 @@
         <w:jc w:val="both"/>
       </w:pPr>
       <w:r>
-        <w:t>Option 2 is to pilot a privacy-preserving cross-payer signal exchange. Each client would retain raw claims while sharing approved aggregate statistics, model updates, or risk fingerprints. This gives Cotiviti a defensible position: broader learning without broader exposure. The pilot should begin with synthetic and historical de-identified data, then graduate to a narrow domain such as wound care, durable medical equipment, high-volume labs, or behavioral health.</w:t>
+        <w:t>Option 2 is to pilot a privacy-preserving cross-payer signal exchange in shadow mode. Each client would retain raw claims while sharing approved aggregate statistics, model updates, or risk fingerprints. This gives Cotiviti a defensible position: broader learning without broader exposure. The pilot should begin with synthetic and historical de-identified data, then graduate to one narrow domain such as wound care, durable medical equipment, high-volume labs, or behavioral health.</w:t>
       </w:r>
     </w:p>
     <w:p>
@@ -160,7 +160,7 @@
         <w:jc w:val="both"/>
       </w:pPr>
       <w:r>
-        <w:t>Option 3 is to productize the evidence chain. Every alert should show the graph path, peer comparison, time-series change, code-policy rationale, confidence level, and recommended next action. The best slogan for the position is simple: no score without a story. That framing aligns technical ambition with Cotiviti's managed-service strength and makes the investment about faster, fairer, and more defensible payment integrity.</w:t>
+        <w:t>Option 3 is to productize the evidence card and reviewer cockpit. Every alert should show the graph path, peer comparison, time-series change, code-policy rationale, confidence level, model-card note, reviewer override reason, and recommended next action. The best slogan for the position is simple: no score without a story. That framing aligns technical ambition with Cotiviti's managed-service strength and makes the investment about faster, fairer, and more defensible payment integrity.</w:t>
       </w:r>
     </w:p>
     <w:p>
@@ -243,7 +243,21 @@
           <w:color w:val="141F2B"/>
           <w:sz w:val="21"/>
         </w:rPr>
-        <w:t>Hamid, Z., Khalique, F., Mahmood, S., Daud, A., Bukhari, A., &amp; Alshemaimri, B. (2024). Healthcare insurance fraud detection using data mining. BMC Medical Informatics and Decision Making, 24, 112. https://doi.org/10.1186/s12911-024-02512-4</w:t>
+        <w:t>De Meulemeester, H., De Smet, F., van Dorst, J., Derroitte, E., &amp; De Moor, B. (2025). Explainable unsupervised anomaly detection for healthcare insurance data. BMC Medical Informatics and Decision Making, 25, 14. https://doi.org/10.1186/s12911-024-02823-6</w:t>
+      </w:r>
+    </w:p>
+    <w:p>
+      <w:pPr>
+        <w:spacing w:after="120" w:line="252" w:lineRule="auto"/>
+        <w:ind w:hanging="504" w:left="504"/>
+      </w:pPr>
+      <w:r>
+        <w:rPr>
+          <w:rFonts w:ascii="Calibri" w:hAnsi="Calibri"/>
+          <w:color w:val="141F2B"/>
+          <w:sz w:val="21"/>
+        </w:rPr>
+        <w:t>du Preez, A., Bhattacharya, S., Beling, P. A., &amp; Bowen, E. (2025). Fraud detection in healthcare claims using machine learning: A systematic review. Artificial Intelligence in Medicine, 160, 103061. https://doi.org/10.1016/j.artmed.2024.103061</w:t>
       </w:r>
     </w:p>
     <w:p>

</xml_diff>